<commit_message>
Revising the Naming the Bones of the Armature 2
</commit_message>
<xml_diff>
--- a/Articles/2026/4_Blender_Tips_and_Tricks/10_Naming_the_Bones_of_the_Armature/No Images  Naming the Bones of the Armature.docx
+++ b/Articles/2026/4_Blender_Tips_and_Tricks/10_Naming_the_Bones_of_the_Armature/No Images  Naming the Bones of the Armature.docx
@@ -7,7 +7,10 @@
         <w:pStyle w:val="Title"/>
       </w:pPr>
       <w:r>
-        <w:t>Naming the Bones of the Body</w:t>
+        <w:t xml:space="preserve">Naming the Bones of the </w:t>
+      </w:r>
+      <w:r>
+        <w:t>Armature</w:t>
       </w:r>
     </w:p>
     <w:p>

</xml_diff>